<commit_message>
chore: update assessment document
</commit_message>
<xml_diff>
--- a/METCOR ASSESSMENT.docx
+++ b/METCOR ASSESSMENT.docx
@@ -408,12 +408,12 @@
         <w:rPr>
           <w:rtl w:val="0"/>
         </w:rPr>
-        <w:t xml:space="preserve">id|user_id|slug|title|description|body|created_at|updated_at|deleted_at</w:t>
+        <w:t xml:space="preserve">id|user_id|slug|title|description|body|created_at|updated_at</w:t>
         <w:br w:type="textWrapping"/>
         <w:br w:type="textWrapping"/>
         <w:t xml:space="preserve">collections</w:t>
         <w:br w:type="textWrapping"/>
-        <w:t xml:space="preserve">id|user_id|name|description|created_at|updated_at|deleted_at</w:t>
+        <w:t xml:space="preserve">id|user_id|name|description|created_at|updated_at|</w:t>
         <w:br w:type="textWrapping"/>
         <w:br w:type="textWrapping"/>
         <w:t xml:space="preserve">article_collections</w:t>
@@ -510,7 +510,7 @@
         <w:rPr>
           <w:rtl w:val="0"/>
         </w:rPr>
-        <w:t xml:space="preserve">POST /api/collections/{collection_id}/articles/{article_id} - Add an article to a collection</w:t>
+        <w:t xml:space="preserve">POST /api/collections/{collection_id}/articles - Add an article to a collection</w:t>
       </w:r>
     </w:p>
     <w:p>
@@ -522,7 +522,7 @@
         <w:rPr>
           <w:rtl w:val="0"/>
         </w:rPr>
-        <w:t xml:space="preserve">DELETE /api/collections/{collection_id}/articles/{article_id} - Remove article from a collection</w:t>
+        <w:t xml:space="preserve">DELETE /api/collections/{collection_id}/articles/{article_slug} - Remove article from a collection</w:t>
         <w:br w:type="textWrapping"/>
         <w:t xml:space="preserve">POST /api/articles - create an article with a linked collection or not.</w:t>
         <w:br w:type="textWrapping"/>
@@ -605,7 +605,7 @@
         <w:br w:type="textWrapping"/>
         <w:t xml:space="preserve">I’d monitor the p50, p95, p99 latency for collection list endpoint.</w:t>
         <w:br w:type="textWrapping"/>
-        <w:t xml:space="preserve">Ideally, I’d include structured logs and trace requests.</w:t>
+        <w:t xml:space="preserve">Ideally, I’d also include structured logs and trace requests.</w:t>
         <w:br w:type="textWrapping"/>
         <w:br w:type="textWrapping"/>
       </w:r>

</xml_diff>